<commit_message>
Rewrite title and abstracts in the department's thesis pattern
- Title now follows predikat (kegiatan) + objek + keterangan metode/tempat
  + studi kasus, as in senior theses supervised by Pak Indra:
  Pengembangan Chatbot Layanan Akademik dan Kemahasiswaan pada Sistem
  E-Office Menggunakan Process-Aware Workflow GraphRAG (Studi Kasus: FSM UNDIP)
- Abstrak/Abstract follow background -> problem -> 'Oleh karena itu,
  penelitian ini ...' -> method -> evaluation -> result -> conclusion
- Body terminology: asisten virtual -> chatbot; layanan persuratan ->
  layanan akademik dan kemahasiswaan
- DOCX cover reads title lines from front/sampul.tex

Co-Authored-By: Claude Opus 5.5 <noreply@anthropic.com>
Claude-Session: https://claude.ai/code/session_017UGmLJx93cmAjGKmGQdVkh
</commit_message>
<xml_diff>
--- a/tex/skripsi.docx
+++ b/tex/skripsi.docx
@@ -14,15 +14,7 @@
           <w:i w:val="0"/>
           <w:sz w:val="24"/>
         </w:rPr>
-        <w:t xml:space="preserve">ASISTEN VIRTUAL BERBASIS </w:t>
-      </w:r>
-      <w:r>
-        <w:rPr>
-          <w:b/>
-          <w:i/>
-          <w:sz w:val="24"/>
-        </w:rPr>
-        <w:t>PROCESS-AWARE</w:t>
+        <w:t>PENGEMBANGAN CHATBOT LAYANAN AKADEMIK DAN</w:t>
       </w:r>
     </w:p>
     <w:p>
@@ -34,10 +26,25 @@
       <w:r>
         <w:rPr>
           <w:b/>
-          <w:i/>
+          <w:i w:val="0"/>
           <w:sz w:val="24"/>
         </w:rPr>
-        <w:t>WORKFLOW</w:t>
+        <w:t>KEMAHASISWAAN PADA SISTEM E-OFFICE MENGGUNAKAN</w:t>
+      </w:r>
+    </w:p>
+    <w:p>
+      <w:pPr>
+        <w:spacing w:line="360" w:lineRule="auto" w:before="0"/>
+        <w:ind w:firstLine="0"/>
+        <w:jc w:val="center"/>
+      </w:pPr>
+      <w:r>
+        <w:rPr>
+          <w:b/>
+          <w:i/>
+          <w:sz w:val="24"/>
+        </w:rPr>
+        <w:t>PROCESS-AWARE WORKFLOW</w:t>
       </w:r>
       <w:r>
         <w:rPr>
@@ -45,7 +52,7 @@
           <w:i w:val="0"/>
           <w:sz w:val="24"/>
         </w:rPr>
-        <w:t xml:space="preserve"> GRAPHRAG UNTUK LAYANAN PERSURATAN</w:t>
+        <w:t xml:space="preserve"> GRAPHRAG</w:t>
       </w:r>
     </w:p>
     <w:p>
@@ -60,37 +67,7 @@
           <w:i w:val="0"/>
           <w:sz w:val="24"/>
         </w:rPr>
-        <w:t>AKADEMIK PADA SISTEM E-OFFICE</w:t>
-      </w:r>
-    </w:p>
-    <w:p>
-      <w:pPr>
-        <w:spacing w:line="360" w:lineRule="auto" w:before="0"/>
-        <w:ind w:firstLine="0"/>
-        <w:jc w:val="center"/>
-      </w:pPr>
-      <w:r>
-        <w:rPr>
-          <w:b/>
-          <w:i w:val="0"/>
-          <w:sz w:val="24"/>
-        </w:rPr>
-        <w:t>(Studi Kasus: Fakultas Sains dan Matematika</w:t>
-      </w:r>
-    </w:p>
-    <w:p>
-      <w:pPr>
-        <w:spacing w:line="360" w:lineRule="auto" w:before="0"/>
-        <w:ind w:firstLine="0"/>
-        <w:jc w:val="center"/>
-      </w:pPr>
-      <w:r>
-        <w:rPr>
-          <w:b/>
-          <w:i w:val="0"/>
-          <w:sz w:val="24"/>
-        </w:rPr>
-        <w:t>Universitas Diponegoro)</w:t>
+        <w:t>(Studi Kasus: FSM UNDIP)</w:t>
       </w:r>
     </w:p>
     <w:p>
@@ -566,7 +543,7 @@
                 <w:rFonts w:ascii="Times New Roman" w:hAnsi="Times New Roman"/>
                 <w:sz w:val="24"/>
               </w:rPr>
-              <w:t>Asisten Virtual Berbasis Process-Aware Workflow GraphRAG untuk Layanan Persuratan Akademik pada Sistem E-Office (Studi Kasus: Fakultas Sains dan Matematika Universitas Diponegoro)</w:t>
+              <w:t>Pengembangan Chatbot Layanan Akademik dan Kemahasiswaan pada Sistem E-Office Menggunakan Process-Aware Workflow GraphRAG (Studi Kasus: FSM UNDIP)</w:t>
             </w:r>
           </w:p>
         </w:tc>
@@ -765,7 +742,7 @@
                 <w:rFonts w:ascii="Times New Roman" w:hAnsi="Times New Roman"/>
                 <w:sz w:val="24"/>
               </w:rPr>
-              <w:t>Asisten Virtual Berbasis Process-Aware Workflow GraphRAG untuk Layanan Persuratan Akademik pada Sistem E-Office (Studi Kasus: Fakultas Sains dan Matematika Universitas Diponegoro)</w:t>
+              <w:t>Pengembangan Chatbot Layanan Akademik dan Kemahasiswaan pada Sistem E-Office Menggunakan Process-Aware Workflow GraphRAG (Studi Kasus: FSM UNDIP)</w:t>
             </w:r>
           </w:p>
         </w:tc>
@@ -1337,7 +1314,7 @@
           <w:i w:val="0"/>
           <w:sz w:val="24"/>
         </w:rPr>
-        <w:t xml:space="preserve">Puji syukur penulis panjatkan ke hadirat Tuhan Yang Maha Esa atas rahmat dan karunia-Nya sehingga penulis dapat menyelesaikan skripsi yang berjudul “Asisten Virtual Berbasis </w:t>
+        <w:t xml:space="preserve">Puji syukur penulis panjatkan ke hadirat Tuhan Yang Maha Esa atas rahmat dan karunia-Nya sehingga penulis dapat menyelesaikan skripsi yang berjudul “Pengembangan Chatbot Layanan Akademik dan Kemahasiswaan pada Sistem E-Office Menggunakan </w:t>
       </w:r>
       <w:r>
         <w:rPr>
@@ -1353,7 +1330,7 @@
           <w:i w:val="0"/>
           <w:sz w:val="24"/>
         </w:rPr>
-        <w:t xml:space="preserve"> GraphRAG untuk Layanan Persuratan Akademik pada Sistem E-Office (Studi Kasus: Fakultas Sains dan Matematika Universitas Diponegoro)”. Skripsi ini disusun sebagai salah satu syarat untuk memperoleh gelar Sarjana Komputer pada Departemen Informatika, Fakultas Sains dan Matematika, Universitas Diponegoro.</w:t>
+        <w:t xml:space="preserve"> GraphRAG (Studi Kasus: FSM UNDIP)”. Skripsi ini disusun sebagai salah satu syarat untuk memperoleh gelar Sarjana Komputer pada Departemen Informatika, Fakultas Sains dan Matematika, Universitas Diponegoro.</w:t>
       </w:r>
     </w:p>
     <w:p>
@@ -1978,7 +1955,7 @@
           <w:i w:val="0"/>
           <w:sz w:val="24"/>
         </w:rPr>
-        <w:t xml:space="preserve">Asisten Virtual Berbasis </w:t>
+        <w:t xml:space="preserve">Pengembangan Chatbot Layanan Akademik dan Kemahasiswaan pada Sistem E-Office Menggunakan </w:t>
       </w:r>
       <w:r>
         <w:rPr>
@@ -1994,7 +1971,7 @@
           <w:i w:val="0"/>
           <w:sz w:val="24"/>
         </w:rPr>
-        <w:t xml:space="preserve"> GraphRAG untuk Layanan Persuratan Akademik pada Sistem E-Office (Studi Kasus: Fakultas Sains dan Matematika Universitas Diponegoro)</w:t>
+        <w:t xml:space="preserve"> GraphRAG (Studi Kasus: FSM UNDIP)</w:t>
       </w:r>
     </w:p>
     <w:p>
@@ -2145,7 +2122,7 @@
           <w:i w:val="0"/>
           <w:sz w:val="24"/>
         </w:rPr>
-        <w:t xml:space="preserve">Layanan administrasi akademik di Fakultas Sains dan Matematika (FSM) Universitas Diponegoro dijalankan berdasarkan Standar Operasional Prosedur (SOP), sehingga staf tata usaha menerima banyak pertanyaan berulang mengenai urutan langkah, pejabat yang bertanggung jawab, dan dokumen persyaratan. Asisten virtual berbasis </w:t>
+        <w:t xml:space="preserve">Mahasiswa Fakultas Sains dan Matematika (FSM) Universitas Diponegoro membutuhkan informasi prosedur layanan akademik dan kemahasiswaan, seperti cuti akademik, legalisir ijazah, dan keterlambatan pembayaran UKT. Informasi tersebut tertuang dalam dokumen Standar Operasional Prosedur (SOP), tetapi mahasiswa masih bertanya langsung kepada staf, sehingga pertanyaan yang sama diajukan berulang kali dan hanya dapat dijawab pada jam layanan. Chatbot berbasis </w:t>
       </w:r>
       <w:r>
         <w:rPr>
@@ -2153,7 +2130,7 @@
           <w:i/>
           <w:sz w:val="24"/>
         </w:rPr>
-        <w:t>Large Language Model</w:t>
+        <w:t>Retrieval-Augmented Generation</w:t>
       </w:r>
       <w:r>
         <w:rPr>
@@ -2161,7 +2138,7 @@
           <w:i w:val="0"/>
           <w:sz w:val="24"/>
         </w:rPr>
-        <w:t xml:space="preserve"> (LLM) dapat menjawab pertanyaan tersebut, tetapi LLM berbasis </w:t>
+        <w:t xml:space="preserve"> (RAG) dapat menjawab pertanyaan tersebut, namun RAG konvensional memperlakukan SOP sebagai teks biasa sehingga jawaban berisiko mencampurkan langkah dari SOP lain, membalik urutan langkah, atau menyebut pejabat yang salah. Oleh karena itu, penelitian ini mengembangkan chatbot layanan akademik dan kemahasiswaan pada sistem E-Office menggunakan </w:t>
       </w:r>
       <w:r>
         <w:rPr>
@@ -2169,7 +2146,7 @@
           <w:i/>
           <w:sz w:val="24"/>
         </w:rPr>
-        <w:t>cloud</w:t>
+        <w:t>Process-Aware Workflow</w:t>
       </w:r>
       <w:r>
         <w:rPr>
@@ -2177,7 +2154,7 @@
           <w:i w:val="0"/>
           <w:sz w:val="24"/>
         </w:rPr>
-        <w:t xml:space="preserve"> menimbulkan biaya per kueri dan risiko kebocoran data mahasiswa, sedangkan </w:t>
+        <w:t xml:space="preserve"> GraphRAG. Metode ini memodelkan setiap SOP sebagai graf alur kerja berarah yang menyimpan urutan langkah, pelaksana, dokumen, dan keluarannya, kemudian memilih SOP yang relevan sebelum jawaban disusun oleh </w:t>
       </w:r>
       <w:r>
         <w:rPr>
@@ -2185,7 +2162,7 @@
           <w:i/>
           <w:sz w:val="24"/>
         </w:rPr>
-        <w:t>Retrieval-Augmented Generation</w:t>
+        <w:t>Large Language Model</w:t>
       </w:r>
       <w:r>
         <w:rPr>
@@ -2193,7 +2170,7 @@
           <w:i w:val="0"/>
           <w:sz w:val="24"/>
         </w:rPr>
-        <w:t xml:space="preserve"> (RAG) konvensional cenderung mencampurkan langkah dari SOP yang berbeda dan membalik urutan langkah. Penelitian ini mengembangkan asisten virtual yang terintegrasi dengan sistem persuratan digital E-Office dan menggunakan mesin </w:t>
+        <w:t xml:space="preserve"> (LLM) yang dijalankan secara lokal. Pengembangan sistem menggunakan model </w:t>
       </w:r>
       <w:r>
         <w:rPr>
@@ -2201,7 +2178,7 @@
           <w:i/>
           <w:sz w:val="24"/>
         </w:rPr>
-        <w:t>Process-Aware Workflow</w:t>
+        <w:t>waterfall</w:t>
       </w:r>
       <w:r>
         <w:rPr>
@@ -2209,7 +2186,7 @@
           <w:i w:val="0"/>
           <w:sz w:val="24"/>
         </w:rPr>
-        <w:t xml:space="preserve"> GraphRAG. Setiap SOP dimodelkan sebagai graf alur kerja berarah yang menyimpan aktor, aksi, dokumen masukan, keluaran, dan durasi setiap langkah. Pemilih SOP berbasis aturan menentukan prosedur yang relevan, langkah-langkahnya diserialisasi secara berurutan, lalu dilengkapi potongan dokumen pendukung sebelum dijawab oleh LLM lokal gemma4:e2b melalui Ollama. Alur percakapan diorkestrasi menggunakan LangGraph dan disajikan melalui antarmuka E-Office berbasis Next.js dengan layanan </w:t>
+        <w:t xml:space="preserve">, dan chatbot diintegrasikan ke E-Office melalui layanan REST. Evaluasi dilakukan menggunakan 40 pertanyaan terverifikasi dengan metrik kelengkapan fakta kunci, cakupan langkah, kesalahan urutan langkah, kesalahan pelaksana, akurasi penolakan, dan jumlah token, serta pengujian </w:t>
       </w:r>
       <w:r>
         <w:rPr>
@@ -2217,7 +2194,7 @@
           <w:i/>
           <w:sz w:val="24"/>
         </w:rPr>
-        <w:t>backend</w:t>
+        <w:t>black-box</w:t>
       </w:r>
       <w:r>
         <w:rPr>
@@ -2225,23 +2202,29 @@
           <w:i w:val="0"/>
           <w:sz w:val="24"/>
         </w:rPr>
-        <w:t xml:space="preserve"> Bun dan Elysia. Evaluasi menggunakan 40 pertanyaan terverifikasi dengan metrik </w:t>
-      </w:r>
-      <w:r>
-        <w:rPr>
-          <w:b w:val="0"/>
-          <w:i/>
-          <w:sz w:val="24"/>
-        </w:rPr>
-        <w:t>key-fact recall</w:t>
-      </w:r>
+        <w:t xml:space="preserve"> terhadap fitur sistem. Hasil pengujian menunjukkan bahwa chatbot mencapai kelengkapan fakta kunci 0,955 dibandingkan 0,712 pada RAG konvensional, mencakup seluruh langkah tanpa kesalahan urutan, dan menggunakan 44% lebih sedikit token dibandingkan pemberian seluruh dokumen SOP. Hasil tersebut menunjukkan bahwa pemilihan SOP dan representasi alur kerja yang eksplisit memungkinkan LLM lokal memberikan jawaban prosedural yang lengkap dan berurutan.</w:t>
+      </w:r>
+    </w:p>
+    <w:p>
+      <w:pPr>
+        <w:spacing w:line="240" w:lineRule="auto" w:before="0"/>
+        <w:ind w:firstLine="0"/>
+        <w:jc w:val="both"/>
+      </w:pPr>
+    </w:p>
+    <w:p>
+      <w:pPr>
+        <w:spacing w:line="240" w:lineRule="auto" w:before="0"/>
+        <w:ind w:firstLine="0"/>
+        <w:jc w:val="left"/>
+      </w:pPr>
       <w:r>
         <w:rPr>
           <w:b w:val="0"/>
           <w:i w:val="0"/>
           <w:sz w:val="24"/>
         </w:rPr>
-        <w:t xml:space="preserve"> (KFR), cakupan langkah, </w:t>
+        <w:t xml:space="preserve">Kata kunci : Chatbot Akademik, </w:t>
       </w:r>
       <w:r>
         <w:rPr>
@@ -2249,7 +2232,7 @@
           <w:i/>
           <w:sz w:val="24"/>
         </w:rPr>
-        <w:t>Topological Inversion Rate</w:t>
+        <w:t>Retrieval-Augmented Generation</w:t>
       </w:r>
       <w:r>
         <w:rPr>
@@ -2257,77 +2240,7 @@
           <w:i w:val="0"/>
           <w:sz w:val="24"/>
         </w:rPr>
-        <w:t xml:space="preserve"> (TIR), </w:t>
-      </w:r>
-      <w:r>
-        <w:rPr>
-          <w:b w:val="0"/>
-          <w:i/>
-          <w:sz w:val="24"/>
-        </w:rPr>
-        <w:t>Actor Mismatch Rate</w:t>
-      </w:r>
-      <w:r>
-        <w:rPr>
-          <w:b w:val="0"/>
-          <w:i w:val="0"/>
-          <w:sz w:val="24"/>
-        </w:rPr>
-        <w:t xml:space="preserve"> (AMR), akurasi penolakan, dan efisiensi token, dilengkapi pengujian </w:t>
-      </w:r>
-      <w:r>
-        <w:rPr>
-          <w:b w:val="0"/>
-          <w:i/>
-          <w:sz w:val="24"/>
-        </w:rPr>
-        <w:t>black-box</w:t>
-      </w:r>
-      <w:r>
-        <w:rPr>
-          <w:b w:val="0"/>
-          <w:i w:val="0"/>
-          <w:sz w:val="24"/>
-        </w:rPr>
-        <w:t xml:space="preserve"> terhadap fitur sistem. Pengujian pendahuluan menunjukkan bahwa mesin tersebut mencapai KFR 0,955 dibandingkan 0,712 pada Naive RAG, cakupan langkah 1,000, TIR 0,000, dan menggunakan 44% lebih sedikit token prompt dibandingkan pemberian seluruh dokumen. Hasil ini menunjukkan bahwa pemilihan prosedur dan representasi alur kerja yang eksplisit memungkinkan LLM berukuran kecil yang berjalan secara lokal memberikan jawaban prosedural yang lengkap dan berurutan.</w:t>
-      </w:r>
-    </w:p>
-    <w:p>
-      <w:pPr>
-        <w:spacing w:line="240" w:lineRule="auto" w:before="0"/>
-        <w:ind w:firstLine="0"/>
-        <w:jc w:val="both"/>
-      </w:pPr>
-    </w:p>
-    <w:p>
-      <w:pPr>
-        <w:spacing w:line="240" w:lineRule="auto" w:before="0"/>
-        <w:ind w:firstLine="0"/>
-        <w:jc w:val="left"/>
-      </w:pPr>
-      <w:r>
-        <w:rPr>
-          <w:b w:val="0"/>
-          <w:i w:val="0"/>
-          <w:sz w:val="24"/>
-        </w:rPr>
-        <w:t xml:space="preserve">Kata kunci : </w:t>
-      </w:r>
-      <w:r>
-        <w:rPr>
-          <w:b w:val="0"/>
-          <w:i/>
-          <w:sz w:val="24"/>
-        </w:rPr>
-        <w:t>Retrieval-Augmented Generation</w:t>
-      </w:r>
-      <w:r>
-        <w:rPr>
-          <w:b w:val="0"/>
-          <w:i w:val="0"/>
-          <w:sz w:val="24"/>
-        </w:rPr>
-        <w:t>, GraphRAG, graf alur kerja, SOP, E-Office, asisten virtual, LLM lokal</w:t>
+        <w:t>, GraphRAG, Graf Alur Kerja, E-Office</w:t>
       </w:r>
     </w:p>
     <w:p>
@@ -2368,7 +2281,7 @@
           <w:i w:val="0"/>
           <w:sz w:val="24"/>
         </w:rPr>
-        <w:t>Academic administration at the Faculty of Science and Mathematics (FSM), Universitas Diponegoro, follows Standard Operating Procedures (SOPs), so administrative staff receive many repeated questions about step order, responsible officials, and required documents. A virtual assistant based on a Large Language Model (LLM) can answer such questions, but cloud-hosted LLMs add per-query costs and risk exposing student data, while conventional Retrieval-Augmented Generation (RAG) tends to mix steps from different SOPs and reverse their order. This research develops a virtual assistant integrated into the E-Office digital correspondence system and powered by a Process-Aware Workflow GraphRAG engine. Each SOP is modelled as a directed workflow graph that stores the actor, action, input documents, outputs, and duration of every step. A rule-based selector identifies the relevant procedure, its steps are serialized in order and complemented with supporting document chunks, and a local LLM, gemma4:e2b served through Ollama, generates the answer. The conversation flow is orchestrated with LangGraph and delivered through the Next.js E-Office interface with a Bun and Elysia backend. Evaluation uses 40 verified questions with key-fact recall (KFR), step coverage, Topological Inversion Rate (TIR), Actor Mismatch Rate (AMR), refusal accuracy, and token efficiency, complemented by black-box testing of system features. Preliminary tests show that the engine reaches a KFR of 0.955 compared with 0.712 for Naive RAG, a step coverage of 1.000 and a TIR of 0.000, while using 44% fewer prompt tokens than supplying every document. These results indicate that procedure selection and an explicit workflow representation allow a small, locally hosted LLM to give complete and correctly ordered procedural answers.</w:t>
+        <w:t>Students of the Faculty of Science and Mathematics (FSM), Diponegoro University, need information on academic and student service procedures, such as academic leave, diploma legalisation, and late tuition payment. This information is written in Standard Operating Procedure (SOP) documents, yet students still ask the staff directly, so the same questions are asked repeatedly and can only be answered during service hours. A chatbot based on Retrieval-Augmented Generation (RAG) can answer these questions, but conventional RAG treats SOPs as plain text, so its answers risk mixing steps from other SOPs, reversing the order of steps, or naming the wrong official. Therefore, this study develops an academic and student service chatbot in the E-Office system using Process-Aware Workflow GraphRAG. The method models each SOP as a directed workflow graph that stores the order of steps, the actors, the documents, and the outputs, then selects the relevant SOP before a locally hosted Large Language Model (LLM) composes the answer. The system is developed with the waterfall model, and the chatbot is integrated into E-Office through a REST service. The evaluation uses 40 verified questions with key-fact completeness, step coverage, step-order errors, actor errors, refusal accuracy, and token count as metrics, together with black-box testing of the system features. The results show that the chatbot reaches a key-fact completeness of 0.955 compared with 0.712 for conventional RAG, covers every step without order errors, and uses 44% fewer tokens than supplying all SOP documents. These results indicate that SOP selection and an explicit workflow representation enable a local LLM to give complete and correctly ordered procedural answers.</w:t>
       </w:r>
     </w:p>
     <w:p>
@@ -2390,7 +2303,7 @@
           <w:i w:val="0"/>
           <w:sz w:val="24"/>
         </w:rPr>
-        <w:t>Keywords : Retrieval-Augmented Generation, GraphRAG, workflow graph, SOP, E-Office, virtual assistant, local LLM</w:t>
+        <w:t>Keywords : Academic Chatbot, Retrieval-Augmented Generation, GraphRAG, Workflow Graph, E-Office</w:t>
       </w:r>
     </w:p>
     <w:p>
@@ -2653,7 +2566,7 @@
         <w:t xml:space="preserve">REGISTERED</w:t>
       </w:r>
       <w:r>
-        <w:t xml:space="preserve">, dan diproses oleh aktor yang berbeda pada setiap tahap. Sistem ini mempercepat pemrosesan surat, tetapi belum menjawab pertanyaan mahasiswa tentang prosedur yang harus ditempuh sebelum dan selama surat diproses. Kebutuhan akan kanal tanya jawab yang tersedia setiap saat dan terhubung langsung dengan E-Office menjadi dasar pengembangan asisten virtual dalam penelitian ini.</w:t>
+        <w:t xml:space="preserve">, dan diproses oleh aktor yang berbeda pada setiap tahap. Sistem ini mempercepat pemrosesan surat, tetapi belum menjawab pertanyaan mahasiswa tentang prosedur yang harus ditempuh sebelum dan selama surat diproses. Kebutuhan akan kanal tanya jawab yang tersedia setiap saat dan terhubung langsung dengan E-Office menjadi dasar pengembangan chatbot dalam penelitian ini.</w:t>
       </w:r>
     </w:p>
     <w:p>
@@ -2661,7 +2574,7 @@
         <w:pStyle w:val="BodyText"/>
       </w:pPr>
       <w:r>
-        <w:t xml:space="preserve">Asisten virtual berbasis</w:t>
+        <w:t xml:space="preserve">Chatbot berbasis</w:t>
       </w:r>
       <w:r>
         <w:t xml:space="preserve"> </w:t>
@@ -2900,7 +2813,7 @@
         <w:pStyle w:val="BodyText"/>
       </w:pPr>
       <w:r>
-        <w:t xml:space="preserve">Berdasarkan uraian tersebut, penelitian ini mengembangkan asisten virtual untuk layanan persuratan akademik yang terintegrasi dengan sistem E-Office dan menggunakan</w:t>
+        <w:t xml:space="preserve">Berdasarkan uraian tersebut, penelitian ini mengembangkan chatbot layanan akademik dan kemahasiswaan yang terintegrasi dengan sistem E-Office dan menggunakan</w:t>
       </w:r>
       <w:r>
         <w:t xml:space="preserve"> </w:t>
@@ -2916,7 +2829,7 @@
         <w:t xml:space="preserve"> </w:t>
       </w:r>
       <w:r>
-        <w:t xml:space="preserve">GraphRAG sebagai mesin tanya jawabnya. Asisten virtual dijalankan dengan LLM lokal agar data mahasiswa tetap berada di lingkungan kampus, diorkestrasi menggunakan LangGraph</w:t>
+        <w:t xml:space="preserve">GraphRAG sebagai mesin tanya jawabnya. Chatbot dijalankan dengan LLM lokal agar data mahasiswa tetap berada di lingkungan kampus, diorkestrasi menggunakan LangGraph</w:t>
       </w:r>
       <w:r>
         <w:t xml:space="preserve"> </w:t>
@@ -2956,7 +2869,7 @@
         <w:jc w:val="both"/>
       </w:pPr>
       <w:r>
-        <w:t xml:space="preserve">Bagaimana membangun asisten virtual yang terintegrasi dengan sistem E-Office dan menggunakan</w:t>
+        <w:t xml:space="preserve">Bagaimana membangun chatbot yang terintegrasi dengan sistem E-Office dan menggunakan</w:t>
       </w:r>
       <w:r>
         <w:t xml:space="preserve"> </w:t>
@@ -2985,7 +2898,7 @@
         <w:jc w:val="both"/>
       </w:pPr>
       <w:r>
-        <w:t xml:space="preserve">Bagaimana kualitas jawaban asisten virtual, yang diukur dengan</w:t>
+        <w:t xml:space="preserve">Bagaimana kualitas jawaban chatbot, yang diukur dengan</w:t>
       </w:r>
       <w:r>
         <w:t xml:space="preserve"> </w:t>
@@ -3037,7 +2950,7 @@
         <w:jc w:val="both"/>
       </w:pPr>
       <w:r>
-        <w:t xml:space="preserve">Bagaimana efisiensi asisten virtual dalam hal jumlah token</w:t>
+        <w:t xml:space="preserve">Bagaimana efisiensi chatbot dalam hal jumlah token</w:t>
       </w:r>
       <w:r>
         <w:t xml:space="preserve"> </w:t>
@@ -3101,7 +3014,7 @@
         <w:jc w:val="both"/>
       </w:pPr>
       <w:r>
-        <w:t xml:space="preserve">Menghasilkan asisten virtual layanan persuratan akademik yang terintegrasi dengan sistem E-Office dan menggunakan</w:t>
+        <w:t xml:space="preserve">Menghasilkan chatbot layanan akademik dan kemahasiswaan yang terintegrasi dengan sistem E-Office dan menggunakan</w:t>
       </w:r>
       <w:r>
         <w:t xml:space="preserve"> </w:t>
@@ -3130,7 +3043,7 @@
         <w:jc w:val="both"/>
       </w:pPr>
       <w:r>
-        <w:t xml:space="preserve">Mengukur kualitas jawaban prosedural asisten virtual dan membandingkannya dengan Naive RAG serta GraphRAG berbasis entitas menggunakan benchmark pertanyaan yang terverifikasi.</w:t>
+        <w:t xml:space="preserve">Mengukur kualitas jawaban prosedural chatbot dan membandingkannya dengan Naive RAG serta GraphRAG berbasis entitas menggunakan benchmark pertanyaan yang terverifikasi.</w:t>
       </w:r>
     </w:p>
     <w:p>
@@ -3159,7 +3072,7 @@
         <w:t xml:space="preserve"> </w:t>
       </w:r>
       <w:r>
-        <w:t xml:space="preserve">dan waktu respons asisten virtual sebagai dasar kelayakan penerapan di lingkungan fakultas.</w:t>
+        <w:t xml:space="preserve">dan waktu respons chatbot sebagai dasar kelayakan penerapan di lingkungan fakultas.</w:t>
       </w:r>
     </w:p>
     <w:bookmarkEnd w:id="22"/>
@@ -3190,7 +3103,7 @@
         <w:jc w:val="both"/>
       </w:pPr>
       <w:r>
-        <w:t xml:space="preserve">Bagi mahasiswa, asisten virtual menyediakan informasi prosedur layanan akademik yang lengkap, berurutan, dan dapat diakses setiap saat langsung dari E-Office.</w:t>
+        <w:t xml:space="preserve">Bagi mahasiswa, chatbot menyediakan informasi prosedur layanan akademik yang lengkap, berurutan, dan dapat diakses setiap saat langsung dari E-Office.</w:t>
       </w:r>
     </w:p>
     <w:p>
@@ -3203,7 +3116,7 @@
         <w:jc w:val="both"/>
       </w:pPr>
       <w:r>
-        <w:t xml:space="preserve">Bagi staf administrasi FSM, asisten virtual mengurangi beban menjawab pertanyaan berulang sehingga staf dapat berfokus pada pemrosesan surat.</w:t>
+        <w:t xml:space="preserve">Bagi staf administrasi FSM, chatbot mengurangi beban menjawab pertanyaan berulang sehingga staf dapat berfokus pada pemrosesan surat.</w:t>
       </w:r>
     </w:p>
     <w:p>
@@ -3346,7 +3259,7 @@
         <w:jc w:val="both"/>
       </w:pPr>
       <w:r>
-        <w:t xml:space="preserve">Asisten virtual hanya menjawab pertanyaan berbahasa Indonesia yang berkaitan dengan ketujuh SOP serta status surat milik pengguna di E-Office, dan menolak pertanyaan di luar cakupan tersebut.</w:t>
+        <w:t xml:space="preserve">Chatbot hanya menjawab pertanyaan berbahasa Indonesia yang berkaitan dengan ketujuh SOP serta status surat milik pengguna di E-Office, dan menolak pertanyaan di luar cakupan tersebut.</w:t>
       </w:r>
     </w:p>
     <w:p>
@@ -3359,7 +3272,7 @@
         <w:jc w:val="both"/>
       </w:pPr>
       <w:r>
-        <w:t xml:space="preserve">Asisten virtual diintegrasikan ke sistem E-Office yang dibangun dengan Next.js pada sisi antarmuka serta Bun dan Elysia pada sisi</w:t>
+        <w:t xml:space="preserve">Chatbot diintegrasikan ke sistem E-Office yang dibangun dengan Next.js pada sisi antarmuka serta Bun dan Elysia pada sisi</w:t>
       </w:r>
       <w:r>
         <w:t xml:space="preserve"> </w:t>
@@ -3508,7 +3421,7 @@
         <w:br/>
       </w:r>
       <w:r>
-        <w:t xml:space="preserve">Bab ini membahas hasil implementasi asisten virtual, hasil evaluasi kualitas jawaban dan efisiensi, hasil pengujian fungsional, serta pembahasannya.</w:t>
+        <w:t xml:space="preserve">Bab ini membahas hasil implementasi chatbot, hasil evaluasi kualitas jawaban dan efisiensi, hasil pengujian fungsional, serta pembahasannya.</w:t>
       </w:r>
     </w:p>
     <w:p>
@@ -3558,7 +3471,7 @@
         <w:pStyle w:val="FirstParagraph"/>
       </w:pPr>
       <w:r>
-        <w:t xml:space="preserve">Bab ini membahas penelitian terkait dan dasar teori yang digunakan dalam penelitian, meliputi sistem E-Office dan SOP layanan akademik, chatbot dan asisten virtual,</w:t>
+        <w:t xml:space="preserve">Bab ini membahas penelitian terkait dan dasar teori yang digunakan dalam penelitian, meliputi sistem E-Office dan SOP layanan akademik, chatbot dan chatbot,</w:t>
       </w:r>
       <w:r>
         <w:t xml:space="preserve"> </w:t>
@@ -4349,7 +4262,7 @@
         <w:t xml:space="preserve"> </w:t>
       </w:r>
       <w:r>
-        <w:t xml:space="preserve">GraphRAG sebagai mesin asisten virtual pada sistem E-Office.</w:t>
+        <w:t xml:space="preserve">GraphRAG sebagai mesin chatbot pada sistem E-Office.</w:t>
       </w:r>
     </w:p>
     <w:bookmarkEnd w:id="28"/>
@@ -4367,7 +4280,7 @@
         <w:pStyle w:val="FirstParagraph"/>
       </w:pPr>
       <w:r>
-        <w:t xml:space="preserve">Subbab ini membahas sistem persuratan digital E-Office yang menjadi tempat penerapan asisten virtual, serta struktur dokumen SOP yang menjadi basis pengetahuannya.</w:t>
+        <w:t xml:space="preserve">Subbab ini membahas sistem persuratan digital E-Office yang menjadi tempat penerapan chatbot, serta struktur dokumen SOP yang menjadi basis pengetahuannya.</w:t>
       </w:r>
     </w:p>
     <w:bookmarkStart w:id="32" w:name="sistem-persuratan-digital-e-office"/>
@@ -4705,7 +4618,7 @@
         <w:t xml:space="preserve">intent</w:t>
       </w:r>
       <w:r>
-        <w:t xml:space="preserve">) dan mengekstraksi entitas, seperti RASA. Asisten virtual generasi terbaru menggunakan LLM sehingga dapat menyusun jawaban baru tanpa harus menyiapkan seluruh pola percakapan terlebih dahulu</w:t>
+        <w:t xml:space="preserve">) dan mengekstraksi entitas, seperti RASA. Chatbot generasi terbaru menggunakan LLM sehingga dapat menyusun jawaban baru tanpa harus menyiapkan seluruh pola percakapan terlebih dahulu</w:t>
       </w:r>
       <w:r>
         <w:t xml:space="preserve"> </w:t>
@@ -5512,7 +5425,7 @@
         <w:t xml:space="preserve">(Brown dkk., 2020)</w:t>
       </w:r>
       <w:r>
-        <w:t xml:space="preserve">. Kemampuan inilah yang memungkinkan LLM digunakan sebagai generator jawaban pada asisten virtual.</w:t>
+        <w:t xml:space="preserve">. Kemampuan inilah yang memungkinkan LLM digunakan sebagai generator jawaban pada chatbot.</w:t>
       </w:r>
     </w:p>
     <w:bookmarkEnd w:id="39"/>
@@ -12075,7 +11988,7 @@
         <w:t xml:space="preserve">(Myers dkk., 2011)</w:t>
       </w:r>
       <w:r>
-        <w:t xml:space="preserve">. Setiap skenario uji berisi masukan, langkah pengujian, hasil yang diharapkan, dan hasil aktual, sehingga dapat digunakan untuk memastikan setiap kebutuhan fungsional asisten virtual dan integrasinya dengan E-Office berjalan sesuai rancangan.</w:t>
+        <w:t xml:space="preserve">. Setiap skenario uji berisi masukan, langkah pengujian, hasil yang diharapkan, dan hasil aktual, sehingga dapat digunakan untuk memastikan setiap kebutuhan fungsional chatbot dan integrasinya dengan E-Office berjalan sesuai rancangan.</w:t>
       </w:r>
     </w:p>
     <w:bookmarkEnd w:id="67"/>
@@ -14032,7 +13945,7 @@
         <w:pStyle w:val="FirstParagraph"/>
       </w:pPr>
       <w:r>
-        <w:t xml:space="preserve">Subbab ini menguraikan kebutuhan fungsional dan nonfungsional asisten virtual berdasarkan studi literatur, analisis sistem E-Office, dan hasil wawancara.</w:t>
+        <w:t xml:space="preserve">Subbab ini menguraikan kebutuhan fungsional dan nonfungsional chatbot berdasarkan studi literatur, analisis sistem E-Office, dan hasil wawancara.</w:t>
       </w:r>
     </w:p>
     <w:bookmarkStart w:id="78" w:name="kebutuhan-fungsional"/>
@@ -14049,7 +13962,7 @@
         <w:pStyle w:val="FirstParagraph"/>
       </w:pPr>
       <w:r>
-        <w:t xml:space="preserve">Kebutuhan fungsional asisten virtual ditunjukkan pada Tabel 3.3.</w:t>
+        <w:t xml:space="preserve">Kebutuhan fungsional chatbot ditunjukkan pada Tabel 3.3.</w:t>
       </w:r>
     </w:p>
     <w:p>
@@ -14057,7 +13970,7 @@
         <w:pStyle w:val="CaptionTabel"/>
       </w:pPr>
       <w:r>
-        <w:t xml:space="preserve">Tabel 3.3 Kebutuhan Fungsional Asisten Virtual</w:t>
+        <w:t xml:space="preserve">Tabel 3.3 Kebutuhan Fungsional Chatbot</w:t>
       </w:r>
     </w:p>
     <w:tbl>
@@ -14075,7 +13988,7 @@
         </w:tblBorders>
         <w:tblLayout w:type="fixed"/>
         <w:tblLook w:firstRow="0" w:lastRow="0" w:firstColumn="0" w:lastColumn="0" w:noHBand="0" w:noVBand="0" w:val="0000"/>
-        <w:tblCaption w:val="Tabel 3.3 Kebutuhan Fungsional Asisten Virtual"/>
+        <w:tblCaption w:val="Tabel 3.3 Kebutuhan Fungsional Chatbot"/>
       </w:tblPr>
       <w:tblGrid>
         <w:gridCol w:w="567"/>
@@ -14694,7 +14607,7 @@
         <w:pStyle w:val="FirstParagraph"/>
       </w:pPr>
       <w:r>
-        <w:t xml:space="preserve">Kebutuhan nonfungsional asisten virtual sebagai berikut:</w:t>
+        <w:t xml:space="preserve">Kebutuhan nonfungsional chatbot sebagai berikut:</w:t>
       </w:r>
     </w:p>
     <w:p>
@@ -14759,7 +14672,7 @@
         <w:jc w:val="both"/>
       </w:pPr>
       <w:r>
-        <w:t xml:space="preserve">Keamanan, yaitu hanya pengguna terautentikasi yang dapat menggunakan asisten virtual, dan status surat hanya ditampilkan kepada pemiliknya.</w:t>
+        <w:t xml:space="preserve">Keamanan, yaitu hanya pengguna terautentikasi yang dapat menggunakan chatbot, dan status surat hanya ditampilkan kepada pemiliknya.</w:t>
       </w:r>
     </w:p>
     <w:bookmarkEnd w:id="79"/>
@@ -14808,7 +14721,7 @@
         <w:pStyle w:val="FirstParagraph"/>
       </w:pPr>
       <w:r>
-        <w:t xml:space="preserve">Arsitektur asisten virtual dan integrasinya dengan E-Office ditunjukkan pada Gambar 3.2. Pengguna berinteraksi melalui widget percakapan pada antarmuka Next.js. Pertanyaan dikirim ke</w:t>
+        <w:t xml:space="preserve">Arsitektur chatbot dan integrasinya dengan E-Office ditunjukkan pada Gambar 3.2. Pengguna berinteraksi melalui widget percakapan pada antarmuka Next.js. Pertanyaan dikirim ke</w:t>
       </w:r>
       <w:r>
         <w:t xml:space="preserve"> </w:t>
@@ -14898,7 +14811,7 @@
         <w:pStyle w:val="CaptionGambar"/>
       </w:pPr>
       <w:r>
-        <w:t xml:space="preserve">Gambar 3.2 Arsitektur Asisten Virtual pada Sistem E-Office</w:t>
+        <w:t xml:space="preserve">Gambar 3.2 Arsitektur Chatbot pada Sistem E-Office</w:t>
       </w:r>
     </w:p>
     <w:bookmarkEnd w:id="84"/>
@@ -15320,7 +15233,7 @@
         <w:pStyle w:val="CaptionGambar"/>
       </w:pPr>
       <w:r>
-        <w:t xml:space="preserve">Gambar 3.3 Rancangan Alur LangGraph Asisten Virtual</w:t>
+        <w:t xml:space="preserve">Gambar 3.3 Rancangan Alur LangGraph Chatbot</w:t>
       </w:r>
     </w:p>
     <w:p>
@@ -21226,7 +21139,7 @@
         <w:pStyle w:val="FirstParagraph"/>
       </w:pPr>
       <w:r>
-        <w:t xml:space="preserve">Bab ini membahas hasil implementasi asisten virtual, hasil pengujian</w:t>
+        <w:t xml:space="preserve">Bab ini membahas hasil implementasi chatbot, hasil pengujian</w:t>
       </w:r>
       <w:r>
         <w:t xml:space="preserve"> </w:t>
@@ -21260,13 +21173,13 @@
       </w:r>
     </w:p>
     <w:bookmarkEnd w:id="105"/>
-    <w:bookmarkStart w:id="106" w:name="X4714eae0e1bb089dfa48e9d0e32594292231a13"/>
+    <w:bookmarkStart w:id="106" w:name="hasil-implementasi-chatbot-pada-e-office"/>
     <w:p>
       <w:pPr>
         <w:pStyle w:val="Heading2"/>
       </w:pPr>
       <w:r>
-        <w:t xml:space="preserve">4.2 Hasil Implementasi Asisten Virtual pada E-Office</w:t>
+        <w:t xml:space="preserve">4.2 Hasil Implementasi Chatbot pada E-Office</w:t>
       </w:r>
     </w:p>
     <w:p>

</xml_diff>

<commit_message>
Fill in NIM and Pak Indra's NIP
Co-Authored-By: Claude Opus 5.5 <noreply@anthropic.com>
Claude-Session: https://claude.ai/code/session_017UGmLJx93cmAjGKmGQdVkh
</commit_message>
<xml_diff>
--- a/tex/skripsi.docx
+++ b/tex/skripsi.docx
@@ -241,7 +241,7 @@
           <w:i w:val="0"/>
           <w:sz w:val="24"/>
         </w:rPr>
-        <w:t>24060122XXXXXX</w:t>
+        <w:t>24060123140172</w:t>
       </w:r>
     </w:p>
     <w:p>
@@ -484,7 +484,7 @@
                 <w:rFonts w:ascii="Times New Roman" w:hAnsi="Times New Roman"/>
                 <w:sz w:val="24"/>
               </w:rPr>
-              <w:t>24060122XXXXXX</w:t>
+              <w:t>24060123140172</w:t>
             </w:r>
           </w:p>
         </w:tc>
@@ -640,7 +640,7 @@
           <w:i w:val="0"/>
           <w:sz w:val="24"/>
         </w:rPr>
-        <w:t>24060122XXXXXX</w:t>
+        <w:t>24060123140172</w:t>
       </w:r>
     </w:p>
     <w:p>
@@ -860,7 +860,7 @@
                 <w:rFonts w:ascii="Times New Roman" w:hAnsi="Times New Roman"/>
                 <w:sz w:val="24"/>
               </w:rPr>
-              <w:t>24060122XXXXXX</w:t>
+              <w:t>24060123140172</w:t>
             </w:r>
           </w:p>
         </w:tc>
@@ -1048,7 +1048,7 @@
                 <w:sz w:val="24"/>
                 <w:u w:val="none"/>
               </w:rPr>
-              <w:t>NIP. ........................</w:t>
+              <w:t>NIP. 19790212 200812 1 002</w:t>
             </w:r>
           </w:p>
         </w:tc>
@@ -1670,7 +1670,7 @@
                 <w:rFonts w:ascii="Times New Roman" w:hAnsi="Times New Roman"/>
                 <w:sz w:val="24"/>
               </w:rPr>
-              <w:t>24060122XXXXXX</w:t>
+              <w:t>24060123140172</w:t>
             </w:r>
           </w:p>
         </w:tc>
@@ -2081,7 +2081,7 @@
           <w:i w:val="0"/>
           <w:sz w:val="24"/>
         </w:rPr>
-        <w:t>24060122XXXXXX</w:t>
+        <w:t>24060123140172</w:t>
       </w:r>
     </w:p>
     <w:p>

</xml_diff>